<commit_message>
Expand BAB 2 (conceptual framework) and start each BAB on a new page
</commit_message>
<xml_diff>
--- a/Laporan_Penelitian_PRIMA_OPSI_2026_v3_Struktur_Panduan.docx
+++ b/Laporan_Penelitian_PRIMA_OPSI_2026_v3_Struktur_Panduan.docx
@@ -344,6 +344,81 @@
           <w:sz w:val="22"/>
         </w:rPr>
         <w:t>2.1 Landasan Teori</w:t>
+      </w:r>
+    </w:p>
+    <w:p>
+      <w:pPr>
+        <w:spacing w:before="0" w:after="40" w:line="276" w:lineRule="auto"/>
+        <w:jc w:val="left"/>
+      </w:pPr>
+      <w:r>
+        <w:rPr>
+          <w:rFonts w:ascii="Times New Roman" w:hAnsi="Times New Roman"/>
+          <w:b w:val="0"/>
+          <w:i w:val="0"/>
+          <w:sz w:val="22"/>
+        </w:rPr>
+        <w:t>2.1.1 Kesadaran Berbahasa</w:t>
+      </w:r>
+    </w:p>
+    <w:p>
+      <w:pPr>
+        <w:spacing w:before="0" w:after="40" w:line="276" w:lineRule="auto"/>
+        <w:jc w:val="left"/>
+      </w:pPr>
+      <w:r>
+        <w:rPr>
+          <w:rFonts w:ascii="Times New Roman" w:hAnsi="Times New Roman"/>
+          <w:b w:val="0"/>
+          <w:i w:val="0"/>
+          <w:sz w:val="22"/>
+        </w:rPr>
+        <w:t>2.1.2 Sikap dan Loyalitas Bahasa</w:t>
+      </w:r>
+    </w:p>
+    <w:p>
+      <w:pPr>
+        <w:spacing w:before="0" w:after="40" w:line="276" w:lineRule="auto"/>
+        <w:jc w:val="left"/>
+      </w:pPr>
+      <w:r>
+        <w:rPr>
+          <w:rFonts w:ascii="Times New Roman" w:hAnsi="Times New Roman"/>
+          <w:b w:val="0"/>
+          <w:i w:val="0"/>
+          <w:sz w:val="22"/>
+        </w:rPr>
+        <w:t>2.1.3 Bahasa Remaja dalam Media Digital</w:t>
+      </w:r>
+    </w:p>
+    <w:p>
+      <w:pPr>
+        <w:spacing w:before="0" w:after="40" w:line="276" w:lineRule="auto"/>
+        <w:jc w:val="left"/>
+      </w:pPr>
+      <w:r>
+        <w:rPr>
+          <w:rFonts w:ascii="Times New Roman" w:hAnsi="Times New Roman"/>
+          <w:b w:val="0"/>
+          <w:i w:val="0"/>
+          <w:sz w:val="22"/>
+        </w:rPr>
+        <w:t>2.1.4 Media Pembelajaran, Gamifikasi, dan PRIMA+</w:t>
+      </w:r>
+    </w:p>
+    <w:p>
+      <w:pPr>
+        <w:spacing w:before="0" w:after="40" w:line="276" w:lineRule="auto"/>
+        <w:jc w:val="left"/>
+      </w:pPr>
+      <w:r>
+        <w:rPr>
+          <w:rFonts w:ascii="Times New Roman" w:hAnsi="Times New Roman"/>
+          <w:b w:val="0"/>
+          <w:i w:val="0"/>
+          <w:sz w:val="22"/>
+        </w:rPr>
+        <w:t>2.1.5 Kerangka Konseptual</w:t>
       </w:r>
     </w:p>
     <w:p>
@@ -1185,6 +1260,11 @@
       </w:r>
     </w:p>
     <w:p>
+      <w:r>
+        <w:br w:type="page"/>
+      </w:r>
+    </w:p>
+    <w:p>
       <w:pPr>
         <w:pStyle w:val="Heading1"/>
         <w:spacing w:before="200" w:after="100" w:line="276" w:lineRule="auto"/>
@@ -1228,7 +1308,23 @@
           <w:i w:val="0"/>
           <w:sz w:val="22"/>
         </w:rPr>
-        <w:t>Kesadaran berbahasa menekankan kemampuan memperhatikan bentuk, fungsi, konteks, dan dampak sosial dari bahasa yang digunakan. Carter (2003) memandang language awareness sebagai kesadaran terhadap bentuk dan fungsi bahasa, sedangkan Fairclough (1992) menekankan pentingnya sikap kritis dalam melihat hubungan bahasa dan kehidupan sosial.</w:t>
+        <w:t>Landasan teori ini menempatkan penelitian dalam kajian sosiolinguistik dan pembelajaran bahasa. Empat pilar teori diuraikan untuk menjelaskan konstruk penelitian, yaitu kesadaran berbahasa, sikap dan loyalitas bahasa, bahasa remaja dalam media digital, serta peran media pembelajaran dan PRIMA+ sebagai sarana penguat loyalitas berbahasa Indonesia.</w:t>
+      </w:r>
+    </w:p>
+    <w:p>
+      <w:pPr>
+        <w:pStyle w:val="Heading3"/>
+        <w:spacing w:before="120" w:after="100" w:line="276" w:lineRule="auto"/>
+        <w:jc w:val="left"/>
+      </w:pPr>
+      <w:r>
+        <w:rPr>
+          <w:rFonts w:ascii="Times New Roman" w:hAnsi="Times New Roman"/>
+          <w:b/>
+          <w:i w:val="0"/>
+          <w:sz w:val="24"/>
+        </w:rPr>
+        <w:t>2.1.1 Kesadaran Berbahasa</w:t>
       </w:r>
     </w:p>
     <w:p>
@@ -1243,7 +1339,23 @@
           <w:i w:val="0"/>
           <w:sz w:val="22"/>
         </w:rPr>
-        <w:t>Loyalitas bahasa merupakan bagian dari sikap bahasa. Garvin dan Mathiot (1968) menempatkan loyalitas bahasa bersama kebanggaan bahasa dan kesadaran norma. Dalam penelitian ini, loyalitas berbahasa Indonesia dimaknai sebagai kemauan siswa untuk menempatkan bahasa Indonesia secara tepat, terutama pada situasi sekolah, komunikasi resmi, dan ruang digital yang berkaitan dengan kegiatan akademik.</w:t>
+        <w:t>Kesadaran berbahasa menekankan kemampuan penutur untuk memperhatikan bentuk, fungsi, konteks, dan dampak sosial dari bahasa yang digunakannya. Carter (2003) memandang language awareness sebagai kesadaran terhadap bentuk dan fungsi bahasa yang dipakai dalam komunikasi. Sementara itu, Fairclough (1992) memperluasnya menjadi kritik bahasa (critical language awareness), yaitu kesadaran tentang hubungan antara bahasa dan kehidupan sosial. Dalam penelitian ini, kesadaran berbahasa menjadi dasar bagi latihan memilih ragam bahasa: siswa diajak mengenali bentuk tuturan, memahami fungsi setiap ragam, dan mengkaji konteks penggunaan bahasa Indonesia di sekolah serta di ruang digital.</w:t>
+      </w:r>
+    </w:p>
+    <w:p>
+      <w:pPr>
+        <w:pStyle w:val="Heading3"/>
+        <w:spacing w:before="120" w:after="100" w:line="276" w:lineRule="auto"/>
+        <w:jc w:val="left"/>
+      </w:pPr>
+      <w:r>
+        <w:rPr>
+          <w:rFonts w:ascii="Times New Roman" w:hAnsi="Times New Roman"/>
+          <w:b/>
+          <w:i w:val="0"/>
+          <w:sz w:val="24"/>
+        </w:rPr>
+        <w:t>2.1.2 Sikap dan Loyalitas Bahasa</w:t>
       </w:r>
     </w:p>
     <w:p>
@@ -1258,7 +1370,23 @@
           <w:i w:val="0"/>
           <w:sz w:val="22"/>
         </w:rPr>
-        <w:t>Bahasa remaja di media sosial memperlihatkan perubahan pilihan kata, campur kode, dan ragam santai. Penelitian tentang pengaruh media sosial terhadap bahasa remaja menunjukkan bahwa media digital memengaruhi gaya penulisan bahasa Indonesia (Prasetyaningrum, 2024) dan penggunaan ragam informal di kalangan remaja (Parlindungan Siahaan dkk., 2024). Temuan tersebut menjadi dasar bahwa pembinaan bahasa perlu dekat dengan kebiasaan komunikasi remaja.</w:t>
+        <w:t>Sikap bahasa merupakan kecenderungan penutur dalam menilai bahasanya sendiri. Loyalitas bahasa merupakan salah satu wujud sikap bahasa. Garvin dan Mathiot (1968) menempatkan tiga ciri sikap bahasa, yaitu kesetiaan bahasa (language loyalty), kebanggaan bahasa (language pride), dan kesadaran akan norma bahasa. Chaer dan Agustina (2014) menjelaskan bahwa loyalitas berbahasa terlihat dari sikap mempertahankan dan mengutamakan bahasa ibu atau bahasa nasional dalam kehidupan sehari-hari. Dalam penelitian ini, loyalitas berbahasa Indonesia dimaknai sebagai kecenderungan siswa untuk menempatkan bahasa Indonesia secara tepat pada situasi sekolah, komunikasi resmi, dan kegiatan akademik, termasuk memilihnya saat berhadapan dengan ragam bahasa lain.</w:t>
+      </w:r>
+    </w:p>
+    <w:p>
+      <w:pPr>
+        <w:pStyle w:val="Heading3"/>
+        <w:spacing w:before="120" w:after="100" w:line="276" w:lineRule="auto"/>
+        <w:jc w:val="left"/>
+      </w:pPr>
+      <w:r>
+        <w:rPr>
+          <w:rFonts w:ascii="Times New Roman" w:hAnsi="Times New Roman"/>
+          <w:b/>
+          <w:i w:val="0"/>
+          <w:sz w:val="24"/>
+        </w:rPr>
+        <w:t>2.1.3 Bahasa Remaja dalam Media Digital</w:t>
       </w:r>
     </w:p>
     <w:p>
@@ -1273,7 +1401,84 @@
           <w:i w:val="0"/>
           <w:sz w:val="22"/>
         </w:rPr>
-        <w:t>Media digital dalam penelitian ini dipahami sebagai sarana pedagogis untuk menghadirkan kasus bahasa dan refleksi, bukan sebagai objek utama rekayasa komputer. Dengan demikian, pengembangan PRIMA+ tetap ditempatkan dalam kajian sosial-humaniora, terutama pembelajaran bahasa, sikap bahasa, dan perilaku komunikasi remaja.</w:t>
+        <w:t>Perkembangan komunikasi digital (Crystal, 2011) mengubah praktik berbahasa remaja. Media sosial memunculkan pemakaian kata-asing, campur kode, dan ragam santai. Prasetyaningrum (2024) menunjukkan bahwa media sosial memengaruhi gaya penulisan bahasa Indonesia, sedangkan Parlindungan Siahaan dkk. (2024) menyoroti penggunaan ragam informal di kalangan remaja. Widyaningrum dkk. (2020) menegaskan bahwa konteks lokal, identitas, dan pengalaman sosial perlu dipahami ketika mengkaji remaja Kota Sampit khususnya. Karena itu, pembinaan bahasa yang melekat pada kebiasaan komunikasi remaja lebih mungkin diterima daripada larangan tanpa pemahaman.</w:t>
+      </w:r>
+    </w:p>
+    <w:p>
+      <w:pPr>
+        <w:pStyle w:val="Heading3"/>
+        <w:spacing w:before="120" w:after="100" w:line="276" w:lineRule="auto"/>
+        <w:jc w:val="left"/>
+      </w:pPr>
+      <w:r>
+        <w:rPr>
+          <w:rFonts w:ascii="Times New Roman" w:hAnsi="Times New Roman"/>
+          <w:b/>
+          <w:i w:val="0"/>
+          <w:sz w:val="24"/>
+        </w:rPr>
+        <w:t>2.1.4 Media Pembelajaran, Gamifikasi, dan PRIMA+</w:t>
+      </w:r>
+    </w:p>
+    <w:p>
+      <w:pPr>
+        <w:spacing w:before="0" w:after="120" w:line="276" w:lineRule="auto"/>
+        <w:jc w:val="both"/>
+      </w:pPr>
+      <w:r>
+        <w:rPr>
+          <w:rFonts w:ascii="Times New Roman" w:hAnsi="Times New Roman"/>
+          <w:b w:val="0"/>
+          <w:i w:val="0"/>
+          <w:sz w:val="22"/>
+        </w:rPr>
+        <w:t>Media pembelajaran merupakan sarana untuk menyampaikan materi dan melatih hasil. Gamifikasi menerapkan elemen permainan untuk mendorong keterlibatan peserta dalam proses belajar. Shortt dkk. (2021) dan Luo (2023) menunjukkan bahwa gamifikasi dapat mendukung pembelajaran bahasa apabila desain dan evaluasinya dirancang secara jelas. PRIMA+ dikembangkan sebagai media kebahasaan yang menghadirkan kasus bahasa, pilihan ragam, kuis kontekstual, refleksi, dan umpan balik. Unsur digital digunakan untuk menghadirkan latihan pilihan berbahasa yang kontekstual, tetapi fokus kajian tetap berada pada kesadaran berbahasa dan loyalitas bahasa Indonesia, bukan semata-mata pada rekayasa perangkat lunak.</w:t>
+      </w:r>
+    </w:p>
+    <w:p>
+      <w:pPr>
+        <w:pStyle w:val="Heading3"/>
+        <w:spacing w:before="120" w:after="100" w:line="276" w:lineRule="auto"/>
+        <w:jc w:val="left"/>
+      </w:pPr>
+      <w:r>
+        <w:rPr>
+          <w:rFonts w:ascii="Times New Roman" w:hAnsi="Times New Roman"/>
+          <w:b/>
+          <w:i w:val="0"/>
+          <w:sz w:val="24"/>
+        </w:rPr>
+        <w:t>2.1.5 Kerangka Konseptual</w:t>
+      </w:r>
+    </w:p>
+    <w:p>
+      <w:pPr>
+        <w:spacing w:before="0" w:after="120" w:line="276" w:lineRule="auto"/>
+        <w:jc w:val="both"/>
+      </w:pPr>
+      <w:r>
+        <w:rPr>
+          <w:rFonts w:ascii="Times New Roman" w:hAnsi="Times New Roman"/>
+          <w:b w:val="0"/>
+          <w:i w:val="0"/>
+          <w:sz w:val="22"/>
+        </w:rPr>
+        <w:t>Berdasarkan landasan di atas, kerangka konseptual penelitian disusun dalam alur sebagai berikut. Pertama, input (masukan) berupa kesadaran berbahasa yang meliputi kepekaan terhadap bentuk, fungsi, konteks, dan sikap kritis. Kedua, proses berupa penggunaan media PRIMA+, yang melatih siswa memilih ragam bahasa, merefleksikan konteks komunikasi, dan menerima umpan balik. Ketiga, output berupa penguatan loyalitas berbahasa Indonesia siswa, yang dijabarkan ke dalam enam indikator: sikap positif, kesetiaan penggunaan, kesadaran norma, kebanggaan bahasa, kemampuan memilih ragam, dan refleksi kritis. Ketiga indikator ini menjadi dasar penyusunan instrumen pengukuran sebagaimana dipetakan dalam Tabel 3, dan dijadikan variabel terikat yang dianalisis melalui desain pretest-posttest.</w:t>
+      </w:r>
+    </w:p>
+    <w:p>
+      <w:pPr>
+        <w:spacing w:before="0" w:after="120" w:line="276" w:lineRule="auto"/>
+        <w:jc w:val="both"/>
+      </w:pPr>
+      <w:r>
+        <w:rPr>
+          <w:rFonts w:ascii="Times New Roman" w:hAnsi="Times New Roman"/>
+          <w:b w:val="0"/>
+          <w:i w:val="0"/>
+          <w:sz w:val="22"/>
+        </w:rPr>
+        <w:t>Hubungan konsep dalam kerangka ini dirangkum dalam bentuk struktural berikut: kesadaran berbahasa sebagai titik berangkat pengembangan media, PRIMA+ sebagai sarana latihan pengambilan keputusan dan refleksi berbahasa, serta loyalitas berbahasa Indonesia sebagai hasil yang ingin dikuatkan. Posisi ini membedakan PRIMA+ dari sekadar media informasi/kebahasaan, karena PRIMA+ mengarahkan siswa untuk aktif memilih ragam dan merefleksikan alasan penggunaan bahasa.</w:t>
       </w:r>
     </w:p>
     <w:p>
@@ -1865,6 +2070,26 @@
         </w:tc>
       </w:tr>
     </w:tbl>
+    <w:p>
+      <w:pPr>
+        <w:spacing w:before="0" w:after="120" w:line="276" w:lineRule="auto"/>
+        <w:jc w:val="both"/>
+      </w:pPr>
+      <w:r>
+        <w:rPr>
+          <w:rFonts w:ascii="Times New Roman" w:hAnsi="Times New Roman"/>
+          <w:b w:val="0"/>
+          <w:i w:val="0"/>
+          <w:sz w:val="22"/>
+        </w:rPr>
+        <w:t>Kajian literatur tersebut menunjukkan bahwa belum banyak penelitian yang mengembangkan media berbasis latihan keputusan berbahasa (decision-making) untuk menguatkan loyalitas bahasa Indonesia remaja dalam konteks sekolah madrasah, khususnya di Kotawaringin Timur. Sebagian besar kajian berfokus pada fenomena bahasa digital dan sikap bahasa secara deskriptif, sementara PRIMA+ mengarahkan pengembangan media yang aktif melatih siswa memilih ragam dan merefleksikan alasan berbahasa. Posisi inilah yang menjadi celah kebaruan (research gap) yang dibahas pada BAB 4 dan BAB 5.</w:t>
+      </w:r>
+    </w:p>
+    <w:p>
+      <w:r>
+        <w:br w:type="page"/>
+      </w:r>
+    </w:p>
     <w:p>
       <w:pPr>
         <w:pStyle w:val="Heading1"/>
@@ -4027,6 +4252,11 @@
       </w:tr>
     </w:tbl>
     <w:p>
+      <w:r>
+        <w:br w:type="page"/>
+      </w:r>
+    </w:p>
+    <w:p>
       <w:pPr>
         <w:pStyle w:val="Heading1"/>
         <w:spacing w:before="200" w:after="100" w:line="276" w:lineRule="auto"/>
@@ -5414,6 +5644,11 @@
           <w:sz w:val="22"/>
         </w:rPr>
         <w:t>[Diisi nanti: pembahasan hasil penelitian dikaitkan dengan teori dan studi pustaka Bab 2; perbandingan dengan penelitian terdahulu; implikasi temuan terhadap penguatan loyalitas berbahasa Indonesia remaja.]</w:t>
+      </w:r>
+    </w:p>
+    <w:p>
+      <w:r>
+        <w:br w:type="page"/>
       </w:r>
     </w:p>
     <w:p>

</xml_diff>